<commit_message>
template has updates. classic business <> developer issues
</commit_message>
<xml_diff>
--- a/template/Subcontractor_Agreement_Template_clean.docx
+++ b/template/Subcontractor_Agreement_Template_clean.docx
@@ -43,7 +43,13 @@
         <w:t xml:space="preserve">Project ID: </w:t>
       </w:r>
       <w:r>
-        <w:t>[KHPXXX]</w:t>
+        <w:t>[</w:t>
+      </w:r>
+      <w:r>
+        <w:t>KHP</w:t>
+      </w:r>
+      <w:r>
+        <w:t>XXX]</w:t>
       </w:r>
     </w:p>
     <w:p>
@@ -81,7 +87,13 @@
         <w:t xml:space="preserve">Scheduled Start Date: </w:t>
       </w:r>
       <w:r>
-        <w:t>[Project Start Date]</w:t>
+        <w:t>[</w:t>
+      </w:r>
+      <w:r>
+        <w:t xml:space="preserve">Project </w:t>
+      </w:r>
+      <w:r>
+        <w:t>Start Date]</w:t>
       </w:r>
     </w:p>
     <w:p>
@@ -93,7 +105,13 @@
         <w:t xml:space="preserve">Scheduled Completion Date: </w:t>
       </w:r>
       <w:r>
-        <w:t>[Project Completion Date]</w:t>
+        <w:t>[</w:t>
+      </w:r>
+      <w:r>
+        <w:t xml:space="preserve">Project </w:t>
+      </w:r>
+      <w:r>
+        <w:t>Completion Date]</w:t>
       </w:r>
       <w:commentRangeEnd w:id="0"/>
       <w:r>
@@ -354,7 +372,13 @@
         </w:numPr>
       </w:pPr>
       <w:r>
-        <w:t>Subcontractor-procured materials that are being delivered to site must be coordinated with KAEDIX a minimum of forty-eight (48) hours in advance.</w:t>
+        <w:t xml:space="preserve">Subcontractor-procured materials </w:t>
+      </w:r>
+      <w:r>
+        <w:t xml:space="preserve">that are being delivered to site </w:t>
+      </w:r>
+      <w:r>
+        <w:t>must be coordinated with KAEDIX a minimum of forty-eight (48) hours in advance.</w:t>
       </w:r>
     </w:p>
     <w:p>
@@ -443,36 +467,52 @@
       </w:r>
     </w:p>
     <w:p>
-      <w:r>
+      <w:pPr>
+        <w:pStyle w:val="Testing"/>
+      </w:pPr>
+      <w:r>
+        <w:t xml:space="preserve">Subcontractor shall make the work accessible at all reasonable times for inspection by the Contractor. </w:t>
+      </w:r>
+    </w:p>
+    <w:p>
+      <w:pPr>
+        <w:pStyle w:val="Testing"/>
+      </w:pPr>
+      <w:r>
+        <w:t>Subcontractor shall at the first opportunity inspect all material and equipment delivered to the job site by others to be used or incorporated in the Subcontractor’s work and give prompt notice of any defect therein.</w:t>
+      </w:r>
+    </w:p>
+    <w:p>
+      <w:pPr>
+        <w:pStyle w:val="Testing"/>
+      </w:pPr>
+      <w:r>
+        <w:t>Subcontractor assumes full responsibility to protect the work done hereunder until final acceptance by the KAEDIX team.</w:t>
+      </w:r>
+    </w:p>
+    <w:p>
+      <w:r>
+        <w:lastRenderedPageBreak/>
         <w:t>Failure to comply with the above Quality Control requirements may result in rejection of the work, required rework at Subcontractor’s expense, and/or withholding of payment until deficiencies are corrected to the satisfaction of KAEDIX.</w:t>
       </w:r>
     </w:p>
     <w:p>
       <w:pPr>
-        <w:spacing w:after="0"/>
-        <w:rPr>
-          <w:rFonts w:ascii="DM Sans 14pt" w:hAnsi="DM Sans 14pt"/>
-          <w:color w:val="C34314" w:themeColor="accent2"/>
-          <w:sz w:val="40"/>
-          <w:szCs w:val="40"/>
-        </w:rPr>
-      </w:pPr>
-      <w:r>
-        <w:br w:type="page"/>
-      </w:r>
-    </w:p>
-    <w:p>
-      <w:pPr>
         <w:pStyle w:val="LegalBulleting"/>
       </w:pPr>
       <w:r>
-        <w:lastRenderedPageBreak/>
         <w:t>Cleanup Requirements</w:t>
       </w:r>
     </w:p>
     <w:p>
       <w:r>
-        <w:t>Subcontractor shall maintain a clean and orderly work area at all times. Cleanup obligations are organized as follows, and expected to be performed daily:</w:t>
+        <w:t>Subcontractor shall maintain a clean and orderly work area at all times. Cleanup obligations are organized as follows</w:t>
+      </w:r>
+      <w:r>
+        <w:t>, and expected to be performed daily</w:t>
+      </w:r>
+      <w:r>
+        <w:t>:</w:t>
       </w:r>
     </w:p>
     <w:p>
@@ -549,7 +589,37 @@
     </w:p>
     <w:p>
       <w:r>
-        <w:t>KAEDIX reserves the right to arrange third-party cleanup for non-compliance, with all associated costs and administrative fees backcharged to the Subcontractor. No construction material or debris must be removed at the end of each day.</w:t>
+        <w:t xml:space="preserve">KAEDIX reserves the right to arrange third-party cleanup for non-compliance, with all associated costs and administrative fees </w:t>
+      </w:r>
+      <w:r>
+        <w:t>backcharged</w:t>
+      </w:r>
+      <w:r>
+        <w:t xml:space="preserve"> to the Subcontractor. </w:t>
+      </w:r>
+      <w:r>
+        <w:t xml:space="preserve">No construction </w:t>
+      </w:r>
+      <w:r>
+        <w:t>material</w:t>
+      </w:r>
+      <w:r>
+        <w:t xml:space="preserve"> or debri</w:t>
+      </w:r>
+      <w:r>
+        <w:t>s</w:t>
+      </w:r>
+      <w:r>
+        <w:t xml:space="preserve"> must be </w:t>
+      </w:r>
+      <w:r>
+        <w:t xml:space="preserve">removed </w:t>
+      </w:r>
+      <w:r>
+        <w:t>at the end of each day</w:t>
+      </w:r>
+      <w:r>
+        <w:t>.</w:t>
       </w:r>
     </w:p>
     <w:p>
@@ -589,7 +659,15 @@
           <w:b/>
           <w:bCs/>
         </w:rPr>
-        <w:t xml:space="preserve">     ☐</w:t>
+        <w:t xml:space="preserve">     </w:t>
+      </w:r>
+      <w:r>
+        <w:rPr>
+          <w:rFonts w:ascii="Segoe UI Symbol" w:hAnsi="Segoe UI Symbol" w:cs="Segoe UI Symbol"/>
+          <w:b/>
+          <w:bCs/>
+        </w:rPr>
+        <w:t>☐</w:t>
       </w:r>
       <w:r>
         <w:rPr>
@@ -597,11 +675,29 @@
           <w:bCs/>
         </w:rPr>
         <w:t xml:space="preserve"> </w:t>
+      </w:r>
+      <w:r>
+        <w:rPr>
+          <w:b/>
+          <w:bCs/>
+        </w:rPr>
         <w:tab/>
+      </w:r>
+      <w:r>
+        <w:rPr>
+          <w:b/>
+          <w:bCs/>
+        </w:rPr>
         <w:t>Insured Subcontractor</w:t>
       </w:r>
       <w:r>
-        <w:t>: Subcontractor maintains the required insurance and agrees to provide documentation. Subcontractor shall maintain, at its own expense, the following insurance coverage for the duration of this Agreement and for a period of one (1) year following completion of the Work:</w:t>
+        <w:t>: Subcontractor maintains the required insurance and agrees to provide documentation.</w:t>
+      </w:r>
+      <w:r>
+        <w:t xml:space="preserve"> </w:t>
+      </w:r>
+      <w:r>
+        <w:t>Subcontractor shall maintain, at its own expense, the following insurance coverage for the duration of this Agreement and for a period of one (1) year following completion of the Work:</w:t>
       </w:r>
     </w:p>
     <w:p>
@@ -625,7 +721,10 @@
         </w:numPr>
       </w:pPr>
       <w:r>
-        <w:t>Workers’ Compensation Insurance in accordance with Arizona statutory requirements.</w:t>
+        <w:t>Workers’ Compensation Insurance in accordance with Arizona statutory requirements</w:t>
+      </w:r>
+      <w:r>
+        <w:t>.</w:t>
       </w:r>
     </w:p>
     <w:p>
@@ -641,12 +740,11 @@
           <w:b/>
           <w:bCs/>
         </w:rPr>
+        <w:lastRenderedPageBreak/>
         <w:t>Certificates of Insurance.</w:t>
       </w:r>
       <w:r>
-        <w:t xml:space="preserve"> Prior to commencing any work, Subcontractor shall provide KAEDIX with Certificates of Insurance evidencing the above coverage. All policies shall name KAEDIX Construction, LLC as an Additional Insured. Subcontractor shall provide KAEDIX with thirty (30) </w:t>
-        <w:lastRenderedPageBreak/>
-        <w:t>days’ written notice prior to any cancellation, non-renewal, or material change to coverage.</w:t>
+        <w:t xml:space="preserve"> Prior to commencing any work, Subcontractor shall provide KAEDIX with Certificates of Insurance evidencing the above coverage. All policies shall name KAEDIX Construction, LLC as an Additional Insured. Subcontractor shall provide KAEDIX with thirty (30) days’ written notice prior to any cancellation, non-renewal, or material change to coverage.</w:t>
       </w:r>
     </w:p>
     <w:p>
@@ -663,7 +761,23 @@
           <w:b/>
           <w:bCs/>
         </w:rPr>
-        <w:t xml:space="preserve">     ☐</w:t>
+        <w:t xml:space="preserve">    </w:t>
+      </w:r>
+      <w:r>
+        <w:rPr>
+          <w:rFonts w:ascii="Segoe UI Symbol" w:hAnsi="Segoe UI Symbol" w:cs="Segoe UI Symbol"/>
+          <w:b/>
+          <w:bCs/>
+        </w:rPr>
+        <w:t xml:space="preserve"> </w:t>
+      </w:r>
+      <w:r>
+        <w:rPr>
+          <w:rFonts w:ascii="Segoe UI Symbol" w:hAnsi="Segoe UI Symbol" w:cs="Segoe UI Symbol"/>
+          <w:b/>
+          <w:bCs/>
+        </w:rPr>
+        <w:t>☐</w:t>
       </w:r>
       <w:r>
         <w:rPr>
@@ -671,11 +785,39 @@
           <w:bCs/>
         </w:rPr>
         <w:t xml:space="preserve"> </w:t>
+      </w:r>
+      <w:r>
+        <w:rPr>
+          <w:b/>
+          <w:bCs/>
+        </w:rPr>
         <w:tab/>
-        <w:t>Uninsured Subcontractor.</w:t>
-      </w:r>
-      <w:r>
-        <w:t xml:space="preserve"> Subcontractors do not maintain insurance coverage shall execute a “</w:t>
+      </w:r>
+      <w:r>
+        <w:rPr>
+          <w:b/>
+          <w:bCs/>
+        </w:rPr>
+        <w:t>Uninsured Subcontractor</w:t>
+      </w:r>
+      <w:r>
+        <w:rPr>
+          <w:b/>
+          <w:bCs/>
+        </w:rPr>
+        <w:t>.</w:t>
+      </w:r>
+      <w:r>
+        <w:t xml:space="preserve"> </w:t>
+      </w:r>
+      <w:r>
+        <w:t>Subcontractors do not maintain insurance coverage</w:t>
+      </w:r>
+      <w:r>
+        <w:t xml:space="preserve"> </w:t>
+      </w:r>
+      <w:r>
+        <w:t>shall execute a “</w:t>
       </w:r>
       <w:r>
         <w:rPr>
@@ -685,7 +827,10 @@
         <w:t>Subcontractor Liability Acknowledgment and Waiver</w:t>
       </w:r>
       <w:r>
-        <w:t>”, which shall be attached to and form part of this Agreement.</w:t>
+        <w:t>”, which shall be attached to and form part of this Agreement</w:t>
+      </w:r>
+      <w:r>
+        <w:t>.</w:t>
       </w:r>
     </w:p>
     <w:p>
@@ -764,7 +909,31 @@
         </w:numPr>
       </w:pPr>
       <w:r>
-        <w:t>Option 5.1.1. or Option 5.1.2. is selected, and all required documentation (Certificate of Insurance or Liability Acknowledgment and Waiver) is submitted and approved by KAEDIX Construction, LLC.</w:t>
+        <w:t>Option 5.</w:t>
+      </w:r>
+      <w:r>
+        <w:t>1</w:t>
+      </w:r>
+      <w:r>
+        <w:t>.1</w:t>
+      </w:r>
+      <w:r>
+        <w:t>.</w:t>
+      </w:r>
+      <w:r>
+        <w:t xml:space="preserve"> or Option 5.</w:t>
+      </w:r>
+      <w:r>
+        <w:t>1.</w:t>
+      </w:r>
+      <w:r>
+        <w:t>2</w:t>
+      </w:r>
+      <w:r>
+        <w:t>.</w:t>
+      </w:r>
+      <w:r>
+        <w:t xml:space="preserve"> is selected, and all required documentation (Certificate of Insurance or Liability Acknowledgment and Waiver) is submitted and approved by KAEDIX Construction, LLC.</w:t>
       </w:r>
     </w:p>
     <w:p>
@@ -841,6 +1010,7 @@
         </w:numPr>
       </w:pPr>
       <w:r>
+        <w:lastRenderedPageBreak/>
         <w:t>Initial Deposit (50%): Due upon execution of this Agreement and receipt of a valid W-9. The Initial Deposit secures scheduling, mobilization, and allocation of labor and resources for the project.</w:t>
       </w:r>
     </w:p>
@@ -865,7 +1035,6 @@
         </w:numPr>
       </w:pPr>
       <w:r>
-        <w:lastRenderedPageBreak/>
         <w:t>Retention (10%): Released upon final completion, closeout, and approval of the Final NCI Walkthrough.</w:t>
       </w:r>
     </w:p>
@@ -882,7 +1051,28 @@
       </w:r>
       <w:commentRangeStart w:id="2"/>
       <w:r>
-        <w:t>Progress payment (40%) shall be withheld until all closeout documentation is received and the work has been accepted by KAEDIX. The Required closeout documentation includes</w:t>
+        <w:t xml:space="preserve">Progress </w:t>
+      </w:r>
+      <w:r>
+        <w:t>payment (</w:t>
+      </w:r>
+      <w:r>
+        <w:t>40%)</w:t>
+      </w:r>
+      <w:r>
+        <w:t xml:space="preserve"> </w:t>
+      </w:r>
+      <w:r>
+        <w:t>shall be withheld until all closeout documentation is received and the work has been accepted by KAEDIX. Th</w:t>
+      </w:r>
+      <w:r>
+        <w:t>e</w:t>
+      </w:r>
+      <w:r>
+        <w:t xml:space="preserve"> </w:t>
+      </w:r>
+      <w:r>
+        <w:t>Required closeout documentation includes</w:t>
       </w:r>
       <w:commentRangeEnd w:id="2"/>
       <w:r>
@@ -1001,7 +1191,19 @@
         <w:t xml:space="preserve">Payment Processing. </w:t>
       </w:r>
       <w:r>
-        <w:t>Upon receipt of all required documentation and approval of the associated work by KAEDIX Construction, LLC, KAEDIX shall process approved payments within five (5) business days through its accounting department. This timeline applies to both Initial Deposit, Progress Payment, and Final Payment.</w:t>
+        <w:t xml:space="preserve">Upon receipt of all required documentation and approval of the associated work by KAEDIX Construction, LLC, KAEDIX shall process approved payments within five (5) business days through its accounting department. This timeline applies to both </w:t>
+      </w:r>
+      <w:r>
+        <w:t xml:space="preserve">Initial Deposit, </w:t>
+      </w:r>
+      <w:r>
+        <w:t>Progress Payment</w:t>
+      </w:r>
+      <w:r>
+        <w:t>,</w:t>
+      </w:r>
+      <w:r>
+        <w:t xml:space="preserve"> and Final Payment.</w:t>
       </w:r>
     </w:p>
     <w:p>
@@ -1025,6 +1227,7 @@
         <w:pStyle w:val="Testing"/>
       </w:pPr>
       <w:r>
+        <w:lastRenderedPageBreak/>
         <w:t>KAEDIX may request changes to the scope of work at any time. Upon receiving a Change Order request, Subcontractor shall provide written pricing within three (3) business days.</w:t>
       </w:r>
     </w:p>
@@ -1041,7 +1244,6 @@
         <w:pStyle w:val="Testing"/>
       </w:pPr>
       <w:r>
-        <w:lastRenderedPageBreak/>
         <w:t>All Change Orders shall reference this Agreement, describe the changed scope, and state the adjusted contract amount and any schedule impact.</w:t>
       </w:r>
     </w:p>
@@ -1122,7 +1324,13 @@
         <w:pStyle w:val="Testing"/>
       </w:pPr>
       <w:r>
-        <w:t>Subcontractor is an independent contractor and not an employee, partner, joint venturer, or agent of KAEDIX, or any of its subsidiaries.</w:t>
+        <w:t>Subcontractor is an independent contractor and not an employee, partner, joint venturer, or agent of</w:t>
+      </w:r>
+      <w:r>
+        <w:t xml:space="preserve"> KAEDIX, or any of its subsidiaries</w:t>
+      </w:r>
+      <w:r>
+        <w:t>.</w:t>
       </w:r>
     </w:p>
     <w:p>
@@ -1150,7 +1358,10 @@
         </w:numPr>
       </w:pPr>
       <w:r>
-        <w:t>Payment of its employees and laborers</w:t>
+        <w:t>P</w:t>
+      </w:r>
+      <w:r>
+        <w:t>ayment of its employees and laborers</w:t>
       </w:r>
     </w:p>
     <w:p>
@@ -1162,7 +1373,10 @@
         </w:numPr>
       </w:pPr>
       <w:r>
-        <w:t>Payroll taxes and employment taxes</w:t>
+        <w:t>P</w:t>
+      </w:r>
+      <w:r>
+        <w:t>ayroll taxes and employment taxes</w:t>
       </w:r>
     </w:p>
     <w:p>
@@ -1174,7 +1388,11 @@
         </w:numPr>
       </w:pPr>
       <w:r>
-        <w:t>Workers’ compensation coverage (if applicable)</w:t>
+        <w:lastRenderedPageBreak/>
+        <w:t>Workers’</w:t>
+      </w:r>
+      <w:r>
+        <w:t xml:space="preserve"> compensation coverage (if applicable)</w:t>
       </w:r>
     </w:p>
     <w:p>
@@ -1186,15 +1404,30 @@
         </w:numPr>
       </w:pPr>
       <w:r>
-        <w:t>Supervision and safety of its workers</w:t>
-      </w:r>
-    </w:p>
-    <w:p>
-      <w:pPr>
-        <w:pStyle w:val="Testing"/>
-      </w:pPr>
-      <w:r>
-        <w:t>Nothing in this Agreement shall be construed to create an employer-employee relationship between KAEDIX Construction, LLC and Subcontractor or any of the Subcontractor’s employees.</w:t>
+        <w:t>S</w:t>
+      </w:r>
+      <w:r>
+        <w:t>upervision and safety of its workers</w:t>
+      </w:r>
+    </w:p>
+    <w:p>
+      <w:pPr>
+        <w:pStyle w:val="Testing"/>
+      </w:pPr>
+      <w:r>
+        <w:t>Nothing in this Agreement shall be construed to create an employer</w:t>
+      </w:r>
+      <w:r>
+        <w:t>-</w:t>
+      </w:r>
+      <w:r>
+        <w:t xml:space="preserve">employee relationship between KAEDIX Construction, LLC and Subcontractor or any of </w:t>
+      </w:r>
+      <w:r>
+        <w:t>the Subcontractor’s</w:t>
+      </w:r>
+      <w:r>
+        <w:t xml:space="preserve"> employees.</w:t>
       </w:r>
     </w:p>
     <w:p>
@@ -1202,7 +1435,6 @@
         <w:pStyle w:val="LegalBulleting"/>
       </w:pPr>
       <w:r>
-        <w:lastRenderedPageBreak/>
         <w:t>Lien Protections</w:t>
       </w:r>
     </w:p>
@@ -1211,7 +1443,13 @@
         <w:pStyle w:val="Testing"/>
       </w:pPr>
       <w:r>
-        <w:t>Subcontractor shall comply with all preliminary notice requirements under Arizona law (A.R.S. § 33-981 et seq.), including but not limited to the twenty (20) day of preliminary notice.</w:t>
+        <w:t xml:space="preserve">Subcontractor shall comply with all preliminary notice requirements under Arizona law (A.R.S. § 33-981 et seq.), including but not limited to the twenty (20) </w:t>
+      </w:r>
+      <w:r>
+        <w:t>day of</w:t>
+      </w:r>
+      <w:r>
+        <w:t xml:space="preserve"> preliminary notice.</w:t>
       </w:r>
     </w:p>
     <w:p>
@@ -1345,7 +1583,11 @@
         <w:t xml:space="preserve">Termination for Convenience. </w:t>
       </w:r>
       <w:r>
-        <w:t>KAEDIX may terminate this Agreement at its discretion with five (5) business days’ written notice. Subcontractor shall be entitled to payment for all approved completed work and documented demobilization costs only. No additional damages, lost profits, or anticipated earnings shall be owed.</w:t>
+        <w:t xml:space="preserve">KAEDIX may terminate this Agreement at its discretion with five (5) business days’ written notice. Subcontractor shall be entitled to payment for all approved completed work and documented </w:t>
+      </w:r>
+      <w:r>
+        <w:lastRenderedPageBreak/>
+        <w:t>demobilization costs only. No additional damages, lost profits, or anticipated earnings shall be owed.</w:t>
       </w:r>
     </w:p>
     <w:p>
@@ -1372,7 +1614,6 @@
           <w:b/>
           <w:bCs/>
         </w:rPr>
-        <w:lastRenderedPageBreak/>
         <w:t xml:space="preserve">Obligations Upon Termination. </w:t>
       </w:r>
       <w:r>
@@ -1504,14 +1745,6 @@
       </w:r>
       <w:r>
         <w:t>. Venue for any proceedings shall be in Maricopa County, Arizona.</w:t>
-      </w:r>
-    </w:p>
-    <w:p>
-      <w:pPr>
-        <w:spacing w:after="0"/>
-      </w:pPr>
-      <w:r>
-        <w:br w:type="page"/>
       </w:r>
     </w:p>
     <w:p>
@@ -1536,9 +1769,6 @@
         <w:tblBorders>
           <w:left w:val="none" w:sz="0" w:space="0" w:color="auto"/>
           <w:right w:val="none" w:sz="0" w:space="0" w:color="auto"/>
-          <w:top w:val="none" w:sz="0" w:space="0" w:color="auto"/>
-          <w:bottom w:val="none" w:sz="0" w:space="0" w:color="auto"/>
-          <w:insideH w:val="none" w:sz="0" w:space="0" w:color="auto"/>
         </w:tblBorders>
         <w:tblLook w:val="04A0" w:firstRow="1" w:lastRow="0" w:firstColumn="1" w:lastColumn="0" w:noHBand="0" w:noVBand="1"/>
       </w:tblPr>
@@ -1557,7 +1787,6 @@
             <w:tcBorders>
               <w:top w:val="nil"/>
               <w:right w:val="nil"/>
-              <w:bottom w:val="nil"/>
             </w:tcBorders>
           </w:tcPr>
           <w:p>
@@ -1609,7 +1838,6 @@
             <w:tcBorders>
               <w:top w:val="nil"/>
               <w:left w:val="nil"/>
-              <w:bottom w:val="nil"/>
             </w:tcBorders>
           </w:tcPr>
           <w:p>
@@ -1624,7 +1852,21 @@
                 <w:b/>
                 <w:bCs/>
               </w:rPr>
-              <w:t>[Company Name]</w:t>
+              <w:t>[</w:t>
+            </w:r>
+            <w:r>
+              <w:rPr>
+                <w:b/>
+                <w:bCs/>
+              </w:rPr>
+              <w:t>Company</w:t>
+            </w:r>
+            <w:r>
+              <w:rPr>
+                <w:b/>
+                <w:bCs/>
+              </w:rPr>
+              <w:t xml:space="preserve"> Name]</w:t>
             </w:r>
           </w:p>
         </w:tc>
@@ -1638,15 +1880,11 @@
             <w:tcW w:w="4495" w:type="dxa"/>
             <w:tcBorders>
               <w:top w:val="nil"/>
-              <w:bottom w:val="nil"/>
               <w:right w:val="nil"/>
             </w:tcBorders>
           </w:tcPr>
           <w:p>
             <w:pPr>
-              <w:pBdr>
-                <w:bottom w:val="single" w:sz="4" w:space="1" w:color="auto"/>
-              </w:pBdr>
               <w:rPr>
                 <w:b/>
                 <w:bCs/>
@@ -1660,8 +1898,7 @@
               <w:t xml:space="preserve">Name: </w:t>
             </w:r>
             <w:r>
-              <w:rPr/>
-              <w:t>[NAME]</w:t>
+              <w:t>[Name]</w:t>
             </w:r>
           </w:p>
           <w:p>
@@ -1698,14 +1935,10 @@
             <w:tcBorders>
               <w:top w:val="nil"/>
               <w:left w:val="nil"/>
-              <w:bottom w:val="nil"/>
             </w:tcBorders>
           </w:tcPr>
           <w:p>
             <w:pPr>
-              <w:pBdr>
-                <w:bottom w:val="single" w:sz="4" w:space="1" w:color="auto"/>
-              </w:pBdr>
               <w:rPr>
                 <w:b/>
                 <w:bCs/>
@@ -1719,8 +1952,7 @@
               <w:t xml:space="preserve">Name: </w:t>
             </w:r>
             <w:r>
-              <w:rPr/>
-              <w:t>[NAME]</w:t>
+              <w:t>[Subcontractor Name]</w:t>
             </w:r>
           </w:p>
         </w:tc>
@@ -1734,15 +1966,12 @@
             <w:tcW w:w="4495" w:type="dxa"/>
             <w:tcBorders>
               <w:top w:val="nil"/>
-              <w:bottom w:val="nil"/>
+              <w:bottom w:val="single" w:sz="4" w:space="0" w:color="auto"/>
               <w:right w:val="nil"/>
             </w:tcBorders>
           </w:tcPr>
           <w:p>
             <w:pPr>
-              <w:pBdr>
-                <w:bottom w:val="single" w:sz="4" w:space="1" w:color="auto"/>
-              </w:pBdr>
               <w:rPr>
                 <w:b/>
                 <w:bCs/>
@@ -1756,8 +1985,13 @@
               <w:t xml:space="preserve">Title: </w:t>
             </w:r>
             <w:r>
-              <w:rPr/>
-              <w:t>[TITLE]</w:t>
+              <w:t>[</w:t>
+            </w:r>
+            <w:r>
+              <w:t>Title</w:t>
+            </w:r>
+            <w:r>
+              <w:t>]</w:t>
             </w:r>
           </w:p>
           <w:p>
@@ -1794,14 +2028,11 @@
             <w:tcBorders>
               <w:top w:val="nil"/>
               <w:left w:val="nil"/>
-              <w:bottom w:val="nil"/>
+              <w:bottom w:val="single" w:sz="4" w:space="0" w:color="auto"/>
             </w:tcBorders>
           </w:tcPr>
           <w:p>
             <w:pPr>
-              <w:pBdr>
-                <w:bottom w:val="single" w:sz="4" w:space="1" w:color="auto"/>
-              </w:pBdr>
               <w:rPr>
                 <w:b/>
                 <w:bCs/>
@@ -1812,11 +2043,40 @@
                 <w:b/>
                 <w:bCs/>
               </w:rPr>
-              <w:t xml:space="preserve">License (If Applicable) #: </w:t>
+              <w:t xml:space="preserve">License </w:t>
             </w:r>
             <w:r>
-              <w:rPr/>
-              <w:t>[License #]</w:t>
+              <w:rPr>
+                <w:b/>
+                <w:bCs/>
+              </w:rPr>
+              <w:t>(If Applicable</w:t>
+            </w:r>
+            <w:r>
+              <w:rPr>
+                <w:b/>
+                <w:bCs/>
+              </w:rPr>
+              <w:t xml:space="preserve">) #: </w:t>
+            </w:r>
+            <w:r>
+              <w:t>[</w:t>
+            </w:r>
+            <w:commentRangeStart w:id="5"/>
+            <w:r>
+              <w:t>License #</w:t>
+            </w:r>
+            <w:commentRangeEnd w:id="5"/>
+            <w:r>
+              <w:rPr>
+                <w:rStyle w:val="CommentReference"/>
+                <w:sz w:val="24"/>
+                <w:szCs w:val="24"/>
+              </w:rPr>
+              <w:commentReference w:id="5"/>
+            </w:r>
+            <w:r>
+              <w:t>]</w:t>
             </w:r>
           </w:p>
         </w:tc>
@@ -1830,15 +2090,11 @@
             <w:tcW w:w="4495" w:type="dxa"/>
             <w:tcBorders>
               <w:top w:val="nil"/>
-              <w:bottom w:val="nil"/>
               <w:right w:val="nil"/>
             </w:tcBorders>
           </w:tcPr>
           <w:p>
             <w:pPr>
-              <w:pBdr>
-                <w:bottom w:val="single" w:sz="4" w:space="1" w:color="auto"/>
-              </w:pBdr>
               <w:rPr>
                 <w:b/>
                 <w:bCs/>
@@ -1852,8 +2108,13 @@
               <w:t xml:space="preserve">Email: </w:t>
             </w:r>
             <w:r>
-              <w:rPr/>
-              <w:t>[Email]</w:t>
+              <w:t>[</w:t>
+            </w:r>
+            <w:r>
+              <w:t>Email</w:t>
+            </w:r>
+            <w:r>
+              <w:t>]</w:t>
             </w:r>
           </w:p>
           <w:p>
@@ -1890,14 +2151,10 @@
             <w:tcBorders>
               <w:top w:val="nil"/>
               <w:left w:val="nil"/>
-              <w:bottom w:val="nil"/>
             </w:tcBorders>
           </w:tcPr>
           <w:p>
             <w:pPr>
-              <w:pBdr>
-                <w:bottom w:val="single" w:sz="4" w:space="1" w:color="auto"/>
-              </w:pBdr>
               <w:rPr>
                 <w:b/>
                 <w:bCs/>
@@ -1911,9 +2168,16 @@
               <w:t xml:space="preserve">Email: </w:t>
             </w:r>
             <w:r>
-              <w:rPr/>
               <w:t>[Email]</w:t>
             </w:r>
+          </w:p>
+          <w:p>
+            <w:pPr>
+              <w:rPr>
+                <w:b/>
+                <w:bCs/>
+              </w:rPr>
+            </w:pPr>
           </w:p>
         </w:tc>
       </w:tr>
@@ -1926,15 +2190,11 @@
             <w:tcW w:w="4495" w:type="dxa"/>
             <w:tcBorders>
               <w:top w:val="nil"/>
-              <w:bottom w:val="nil"/>
               <w:right w:val="nil"/>
             </w:tcBorders>
           </w:tcPr>
           <w:p>
             <w:pPr>
-              <w:pBdr>
-                <w:bottom w:val="single" w:sz="4" w:space="1" w:color="auto"/>
-              </w:pBdr>
               <w:rPr>
                 <w:b/>
                 <w:bCs/>
@@ -1982,14 +2242,10 @@
             <w:tcBorders>
               <w:top w:val="nil"/>
               <w:left w:val="nil"/>
-              <w:bottom w:val="nil"/>
             </w:tcBorders>
           </w:tcPr>
           <w:p>
             <w:pPr>
-              <w:pBdr>
-                <w:bottom w:val="single" w:sz="4" w:space="1" w:color="auto"/>
-              </w:pBdr>
               <w:rPr>
                 <w:b/>
                 <w:bCs/>
@@ -2014,15 +2270,11 @@
             <w:tcW w:w="4495" w:type="dxa"/>
             <w:tcBorders>
               <w:top w:val="nil"/>
-              <w:bottom w:val="nil"/>
               <w:right w:val="nil"/>
             </w:tcBorders>
           </w:tcPr>
           <w:p>
             <w:pPr>
-              <w:pBdr>
-                <w:bottom w:val="single" w:sz="4" w:space="1" w:color="auto"/>
-              </w:pBdr>
               <w:rPr>
                 <w:b/>
                 <w:bCs/>
@@ -2033,7 +2285,14 @@
                 <w:b/>
                 <w:bCs/>
               </w:rPr>
-              <w:t>Date:</w:t>
+              <w:t>Date</w:t>
+            </w:r>
+            <w:r>
+              <w:rPr>
+                <w:b/>
+                <w:bCs/>
+              </w:rPr>
+              <w:t>:</w:t>
             </w:r>
           </w:p>
           <w:p>
@@ -2070,14 +2329,10 @@
             <w:tcBorders>
               <w:top w:val="nil"/>
               <w:left w:val="nil"/>
-              <w:bottom w:val="nil"/>
             </w:tcBorders>
           </w:tcPr>
           <w:p>
             <w:pPr>
-              <w:pBdr>
-                <w:bottom w:val="single" w:sz="4" w:space="1" w:color="auto"/>
-              </w:pBdr>
               <w:rPr>
                 <w:b/>
                 <w:bCs/>
@@ -2088,7 +2343,14 @@
                 <w:b/>
                 <w:bCs/>
               </w:rPr>
-              <w:t>Date:</w:t>
+              <w:t>Date</w:t>
+            </w:r>
+            <w:r>
+              <w:rPr>
+                <w:b/>
+                <w:bCs/>
+              </w:rPr>
+              <w:t>:</w:t>
             </w:r>
           </w:p>
         </w:tc>
@@ -2103,7 +2365,6 @@
             <w:tcBorders>
               <w:top w:val="nil"/>
               <w:right w:val="nil"/>
-              <w:bottom w:val="nil"/>
             </w:tcBorders>
           </w:tcPr>
           <w:p>
@@ -2148,7 +2409,6 @@
             <w:tcBorders>
               <w:top w:val="nil"/>
               <w:left w:val="nil"/>
-              <w:bottom w:val="nil"/>
             </w:tcBorders>
           </w:tcPr>
           <w:p>
@@ -2184,7 +2444,10 @@
     </w:p>
     <w:p>
       <w:r>
-        <w:t>See attached pages.</w:t>
+        <w:t>See attached pages</w:t>
+      </w:r>
+      <w:r>
+        <w:t>.</w:t>
       </w:r>
     </w:p>
     <w:sectPr>
@@ -2323,7 +2586,7 @@
   <w15:commentEx w15:paraId="31F45EFB" w15:done="1"/>
   <w15:commentEx w15:paraId="4E87E06D" w15:done="1"/>
   <w15:commentEx w15:paraId="0BCE4879" w15:paraIdParent="4E87E06D" w15:done="1"/>
-  <w15:commentEx w15:paraId="17EE39E2" w15:done="1"/>
+  <w15:commentEx w15:paraId="3304978F" w15:done="1"/>
 </w15:commentsEx>
 </file>
 
@@ -2357,7 +2620,7 @@
   <w16cid:commentId w16cid:paraId="31F45EFB" w16cid:durableId="0FFA6AEA"/>
   <w16cid:commentId w16cid:paraId="4E87E06D" w16cid:durableId="4A7E1DEB"/>
   <w16cid:commentId w16cid:paraId="0BCE4879" w16cid:durableId="346C05CB"/>
-  <w16cid:commentId w16cid:paraId="17EE39E2" w16cid:durableId="6EEF32C6"/>
+  <w16cid:commentId w16cid:paraId="3304978F" w16cid:durableId="6EEF32C6"/>
 </w16cid:commentsIds>
 </file>
 
@@ -8489,10 +8752,6 @@
 </file>
 
 <file path=customXml/item1.xml><?xml version="1.0" encoding="utf-8"?>
-<b:Sources xmlns:b="http://schemas.openxmlformats.org/officeDocument/2006/bibliography" xmlns="http://schemas.openxmlformats.org/officeDocument/2006/bibliography" SelectedStyle="/APASixthEditionOfficeOnline.xsl" StyleName="APA" Version="6"/>
-</file>
-
-<file path=customXml/item2.xml><?xml version="1.0" encoding="utf-8"?>
 <?mso-contentType ?>
 <FormTemplates xmlns="http://schemas.microsoft.com/sharepoint/v3/contenttype/forms">
   <Display>DocumentLibraryForm</Display>
@@ -8501,7 +8760,23 @@
 </FormTemplates>
 </file>
 
+<file path=customXml/item2.xml><?xml version="1.0" encoding="utf-8"?>
+<b:Sources xmlns:b="http://schemas.openxmlformats.org/officeDocument/2006/bibliography" xmlns="http://schemas.openxmlformats.org/officeDocument/2006/bibliography" SelectedStyle="/APASixthEditionOfficeOnline.xsl" StyleName="APA" Version="6"/>
+</file>
+
 <file path=customXml/item3.xml><?xml version="1.0" encoding="utf-8"?>
+<p:properties xmlns:p="http://schemas.microsoft.com/office/2006/metadata/properties" xmlns:xsi="http://www.w3.org/2001/XMLSchema-instance" xmlns:pc="http://schemas.microsoft.com/office/infopath/2007/PartnerControls">
+  <documentManagement>
+    <TaxCatchAll xmlns="e56e774f-dbc0-4486-a771-63469ad26ef8" xsi:nil="true"/>
+    <lcf76f155ced4ddcb4097134ff3c332f xmlns="d35464e6-bec8-4d92-81e5-ba01727569ca">
+      <Terms xmlns="http://schemas.microsoft.com/office/infopath/2007/PartnerControls"/>
+    </lcf76f155ced4ddcb4097134ff3c332f>
+    <MediaLengthInSeconds xmlns="d35464e6-bec8-4d92-81e5-ba01727569ca" xsi:nil="true"/>
+  </documentManagement>
+</p:properties>
+</file>
+
+<file path=customXml/item4.xml><?xml version="1.0" encoding="utf-8"?>
 <ct:contentTypeSchema xmlns:ct="http://schemas.microsoft.com/office/2006/metadata/contentType" xmlns:ma="http://schemas.microsoft.com/office/2006/metadata/properties/metaAttributes" ct:_="" ma:_="" ma:contentTypeName="Document" ma:contentTypeID="0x0101009D72BF56F5188E448D4206A646444629" ma:contentTypeVersion="14" ma:contentTypeDescription="Create a new document." ma:contentTypeScope="" ma:versionID="1ac0344c9a099542b0acd3f3a3c05c1b">
   <xsd:schema xmlns:xsd="http://www.w3.org/2001/XMLSchema" xmlns:xs="http://www.w3.org/2001/XMLSchema" xmlns:p="http://schemas.microsoft.com/office/2006/metadata/properties" xmlns:ns2="d35464e6-bec8-4d92-81e5-ba01727569ca" xmlns:ns3="e56e774f-dbc0-4486-a771-63469ad26ef8" targetNamespace="http://schemas.microsoft.com/office/2006/metadata/properties" ma:root="true" ma:fieldsID="fdb7d1f9fee1b7ae8da455765f24e8df" ns2:_="" ns3:_="">
     <xsd:import namespace="d35464e6-bec8-4d92-81e5-ba01727569ca"/>
@@ -8714,19 +8989,15 @@
 </ct:contentTypeSchema>
 </file>
 
-<file path=customXml/item4.xml><?xml version="1.0" encoding="utf-8"?>
-<p:properties xmlns:p="http://schemas.microsoft.com/office/2006/metadata/properties" xmlns:xsi="http://www.w3.org/2001/XMLSchema-instance" xmlns:pc="http://schemas.microsoft.com/office/infopath/2007/PartnerControls">
-  <documentManagement>
-    <TaxCatchAll xmlns="e56e774f-dbc0-4486-a771-63469ad26ef8" xsi:nil="true"/>
-    <lcf76f155ced4ddcb4097134ff3c332f xmlns="d35464e6-bec8-4d92-81e5-ba01727569ca">
-      <Terms xmlns="http://schemas.microsoft.com/office/infopath/2007/PartnerControls"/>
-    </lcf76f155ced4ddcb4097134ff3c332f>
-    <MediaLengthInSeconds xmlns="d35464e6-bec8-4d92-81e5-ba01727569ca" xsi:nil="true"/>
-  </documentManagement>
-</p:properties>
+<file path=customXml/itemProps1.xml><?xml version="1.0" encoding="utf-8"?>
+<ds:datastoreItem xmlns:ds="http://schemas.openxmlformats.org/officeDocument/2006/customXml" ds:itemID="{F25A6743-D4A5-43F0-A160-C91A02EAF780}">
+  <ds:schemaRefs>
+    <ds:schemaRef ds:uri="http://schemas.microsoft.com/sharepoint/v3/contenttype/forms"/>
+  </ds:schemaRefs>
+</ds:datastoreItem>
 </file>
 
-<file path=customXml/itemProps1.xml><?xml version="1.0" encoding="utf-8"?>
+<file path=customXml/itemProps2.xml><?xml version="1.0" encoding="utf-8"?>
 <ds:datastoreItem xmlns:ds="http://schemas.openxmlformats.org/officeDocument/2006/customXml" ds:itemID="{7F29B39F-EEB7-174C-9F75-07CC3973B37E}">
   <ds:schemaRefs>
     <ds:schemaRef ds:uri="http://schemas.openxmlformats.org/officeDocument/2006/bibliography"/>
@@ -8734,15 +9005,18 @@
 </ds:datastoreItem>
 </file>
 
-<file path=customXml/itemProps2.xml><?xml version="1.0" encoding="utf-8"?>
-<ds:datastoreItem xmlns:ds="http://schemas.openxmlformats.org/officeDocument/2006/customXml" ds:itemID="{F25A6743-D4A5-43F0-A160-C91A02EAF780}">
+<file path=customXml/itemProps3.xml><?xml version="1.0" encoding="utf-8"?>
+<ds:datastoreItem xmlns:ds="http://schemas.openxmlformats.org/officeDocument/2006/customXml" ds:itemID="{550D590B-1580-4880-BBB6-641A0C476C0A}">
   <ds:schemaRefs>
-    <ds:schemaRef ds:uri="http://schemas.microsoft.com/sharepoint/v3/contenttype/forms"/>
+    <ds:schemaRef ds:uri="http://schemas.microsoft.com/office/2006/metadata/properties"/>
+    <ds:schemaRef ds:uri="http://schemas.microsoft.com/office/infopath/2007/PartnerControls"/>
+    <ds:schemaRef ds:uri="e56e774f-dbc0-4486-a771-63469ad26ef8"/>
+    <ds:schemaRef ds:uri="d35464e6-bec8-4d92-81e5-ba01727569ca"/>
   </ds:schemaRefs>
 </ds:datastoreItem>
 </file>
 
-<file path=customXml/itemProps3.xml><?xml version="1.0" encoding="utf-8"?>
+<file path=customXml/itemProps4.xml><?xml version="1.0" encoding="utf-8"?>
 <ds:datastoreItem xmlns:ds="http://schemas.openxmlformats.org/officeDocument/2006/customXml" ds:itemID="{B24C9D40-A863-4852-B010-676242B63F1D}">
   <ds:schemaRefs>
     <ds:schemaRef ds:uri="http://schemas.microsoft.com/office/2006/metadata/contentType"/>
@@ -8761,17 +9035,6 @@
 </ds:datastoreItem>
 </file>
 
-<file path=customXml/itemProps4.xml><?xml version="1.0" encoding="utf-8"?>
-<ds:datastoreItem xmlns:ds="http://schemas.openxmlformats.org/officeDocument/2006/customXml" ds:itemID="{550D590B-1580-4880-BBB6-641A0C476C0A}">
-  <ds:schemaRefs>
-    <ds:schemaRef ds:uri="http://schemas.microsoft.com/office/2006/metadata/properties"/>
-    <ds:schemaRef ds:uri="http://schemas.microsoft.com/office/infopath/2007/PartnerControls"/>
-    <ds:schemaRef ds:uri="e56e774f-dbc0-4486-a771-63469ad26ef8"/>
-    <ds:schemaRef ds:uri="d35464e6-bec8-4d92-81e5-ba01727569ca"/>
-  </ds:schemaRefs>
-</ds:datastoreItem>
-</file>
-
 <file path=docMetadata/LabelInfo.xml><?xml version="1.0" encoding="utf-8"?>
 <clbl:labelList xmlns:clbl="http://schemas.microsoft.com/office/2020/mipLabelMetadata">
   <clbl:label id="{0bfe01ca-a253-430f-984b-191ad0c00136}" enabled="0" method="" siteId="{0bfe01ca-a253-430f-984b-191ad0c00136}" removed="1"/>

</xml_diff>